<commit_message>
Simplify two-pager scenario table; plain-language capacity/margin note
Co-Authored-By: Claude Fable 5 <noreply@anthropic.com>
Claude-Session: https://claude.ai/code/session_015m2wC9de21Ykdh6niNZrqh
</commit_message>
<xml_diff>
--- a/HarrisonClarke-First-90-Days.docx
+++ b/HarrisonClarke-First-90-Days.docx
@@ -763,15 +763,14 @@
         </w:tblBorders>
       </w:tblPr>
       <w:tblGrid>
-        <w:gridCol w:w="3600"/>
-        <w:gridCol w:w="1800"/>
-        <w:gridCol w:w="1800"/>
-        <w:gridCol w:w="1800"/>
+        <w:gridCol w:w="1500"/>
+        <w:gridCol w:w="5600"/>
+        <w:gridCol w:w="1900"/>
       </w:tblGrid>
       <w:tr>
         <w:tc>
           <w:tcPr>
-            <w:tcW w:type="dxa" w:w="3600"/>
+            <w:tcW w:type="dxa" w:w="1500"/>
             <w:shd w:fill="1F3864" w:val="clear"/>
             <w:tcMar>
               <w:top w:type="dxa" w:w="40"/>
@@ -789,13 +788,37 @@
                 <w:sz w:val="18"/>
                 <w:szCs w:val="18"/>
               </w:rPr>
-              <w:t xml:space="preserve">12-month incremental (your fees &amp; close rates)</w:t>
-            </w:r>
-          </w:p>
-        </w:tc>
-        <w:tc>
-          <w:tcPr>
-            <w:tcW w:type="dxa" w:w="1800"/>
+              <w:t xml:space="preserve">Scenario</w:t>
+            </w:r>
+          </w:p>
+        </w:tc>
+        <w:tc>
+          <w:tcPr>
+            <w:tcW w:type="dxa" w:w="5600"/>
+            <w:shd w:fill="1F3864" w:val="clear"/>
+            <w:tcMar>
+              <w:top w:type="dxa" w:w="40"/>
+              <w:left w:type="dxa" w:w="80"/>
+              <w:bottom w:type="dxa" w:w="40"/>
+              <w:right w:type="dxa" w:w="80"/>
+            </w:tcMar>
+          </w:tcPr>
+          <w:p>
+            <w:r>
+              <w:rPr>
+                <w:b/>
+                <w:bCs/>
+                <w:color w:val="FFFFFF"/>
+                <w:sz w:val="18"/>
+                <w:szCs w:val="18"/>
+              </w:rPr>
+              <w:t xml:space="preserve">What changes</w:t>
+            </w:r>
+          </w:p>
+        </w:tc>
+        <w:tc>
+          <w:tcPr>
+            <w:tcW w:type="dxa" w:w="1900"/>
             <w:shd w:fill="1F3864" w:val="clear"/>
             <w:tcMar>
               <w:top w:type="dxa" w:w="40"/>
@@ -816,14 +839,59 @@
                 <w:sz w:val="18"/>
                 <w:szCs w:val="18"/>
               </w:rPr>
+              <w:t xml:space="preserve">New revenue / year</w:t>
+            </w:r>
+          </w:p>
+        </w:tc>
+      </w:tr>
+      <w:tr>
+        <w:tc>
+          <w:tcPr>
+            <w:tcW w:type="dxa" w:w="1500"/>
+            <w:tcMar>
+              <w:top w:type="dxa" w:w="40"/>
+              <w:left w:type="dxa" w:w="80"/>
+              <w:bottom w:type="dxa" w:w="40"/>
+              <w:right w:type="dxa" w:w="80"/>
+            </w:tcMar>
+          </w:tcPr>
+          <w:p>
+            <w:r>
+              <w:rPr>
+                <w:b/>
+                <w:bCs/>
+                <w:sz w:val="18"/>
+                <w:szCs w:val="18"/>
+              </w:rPr>
               <w:t xml:space="preserve">Conservative</w:t>
             </w:r>
           </w:p>
         </w:tc>
         <w:tc>
           <w:tcPr>
-            <w:tcW w:type="dxa" w:w="1800"/>
-            <w:shd w:fill="1F3864" w:val="clear"/>
+            <w:tcW w:type="dxa" w:w="5600"/>
+            <w:tcMar>
+              <w:top w:type="dxa" w:w="40"/>
+              <w:left w:type="dxa" w:w="80"/>
+              <w:bottom w:type="dxa" w:w="40"/>
+              <w:right w:type="dxa" w:w="80"/>
+            </w:tcMar>
+          </w:tcPr>
+          <w:p>
+            <w:r>
+              <w:rPr>
+                <w:b w:val="false"/>
+                <w:bCs w:val="false"/>
+                <w:sz w:val="18"/>
+                <w:szCs w:val="18"/>
+              </w:rPr>
+              <w:t xml:space="preserve">1 dilapidations instruction a quarter; 1 commercial survey a quarter; a tenth of the expert witness gap; +2 party wall enquiries a month</w:t>
+            </w:r>
+          </w:p>
+        </w:tc>
+        <w:tc>
+          <w:tcPr>
+            <w:tcW w:type="dxa" w:w="1900"/>
             <w:tcMar>
               <w:top w:type="dxa" w:w="40"/>
               <w:left w:type="dxa" w:w="80"/>
@@ -839,7 +907,30 @@
               <w:rPr>
                 <w:b/>
                 <w:bCs/>
-                <w:color w:val="FFFFFF"/>
+                <w:sz w:val="18"/>
+                <w:szCs w:val="18"/>
+              </w:rPr>
+              <w:t xml:space="preserve">~£53k</w:t>
+            </w:r>
+          </w:p>
+        </w:tc>
+      </w:tr>
+      <w:tr>
+        <w:tc>
+          <w:tcPr>
+            <w:tcW w:type="dxa" w:w="1500"/>
+            <w:tcMar>
+              <w:top w:type="dxa" w:w="40"/>
+              <w:left w:type="dxa" w:w="80"/>
+              <w:bottom w:type="dxa" w:w="40"/>
+              <w:right w:type="dxa" w:w="80"/>
+            </w:tcMar>
+          </w:tcPr>
+          <w:p>
+            <w:r>
+              <w:rPr>
+                <w:b/>
+                <w:bCs/>
                 <w:sz w:val="18"/>
                 <w:szCs w:val="18"/>
               </w:rPr>
@@ -849,8 +940,29 @@
         </w:tc>
         <w:tc>
           <w:tcPr>
-            <w:tcW w:type="dxa" w:w="1800"/>
-            <w:shd w:fill="1F3864" w:val="clear"/>
+            <w:tcW w:type="dxa" w:w="5600"/>
+            <w:tcMar>
+              <w:top w:type="dxa" w:w="40"/>
+              <w:left w:type="dxa" w:w="80"/>
+              <w:bottom w:type="dxa" w:w="40"/>
+              <w:right w:type="dxa" w:w="80"/>
+            </w:tcMar>
+          </w:tcPr>
+          <w:p>
+            <w:r>
+              <w:rPr>
+                <w:b w:val="false"/>
+                <w:bCs w:val="false"/>
+                <w:sz w:val="18"/>
+                <w:szCs w:val="18"/>
+              </w:rPr>
+              <w:t xml:space="preserve">~1 London dilapidations instruction a month; ~1 commercial survey a month; a quarter of the expert witness gap; +4 party wall enquiries a month</w:t>
+            </w:r>
+          </w:p>
+        </w:tc>
+        <w:tc>
+          <w:tcPr>
+            <w:tcW w:type="dxa" w:w="1900"/>
             <w:tcMar>
               <w:top w:type="dxa" w:w="40"/>
               <w:left w:type="dxa" w:w="80"/>
@@ -866,11 +978,10 @@
               <w:rPr>
                 <w:b/>
                 <w:bCs/>
-                <w:color w:val="FFFFFF"/>
-                <w:sz w:val="18"/>
-                <w:szCs w:val="18"/>
-              </w:rPr>
-              <w:t xml:space="preserve">Stretch</w:t>
+                <w:sz w:val="18"/>
+                <w:szCs w:val="18"/>
+              </w:rPr>
+              <w:t xml:space="preserve">~£128k</w:t>
             </w:r>
           </w:p>
         </w:tc>
@@ -878,7 +989,7 @@
       <w:tr>
         <w:tc>
           <w:tcPr>
-            <w:tcW w:type="dxa" w:w="3600"/>
+            <w:tcW w:type="dxa" w:w="1500"/>
             <w:tcMar>
               <w:top w:type="dxa" w:w="40"/>
               <w:left w:type="dxa" w:w="80"/>
@@ -894,13 +1005,35 @@
                 <w:sz w:val="18"/>
                 <w:szCs w:val="18"/>
               </w:rPr>
-              <w:t xml:space="preserve">Dilapidations (London-led)</w:t>
-            </w:r>
-          </w:p>
-        </w:tc>
-        <w:tc>
-          <w:tcPr>
-            <w:tcW w:type="dxa" w:w="1800"/>
+              <w:t xml:space="preserve">Stretch</w:t>
+            </w:r>
+          </w:p>
+        </w:tc>
+        <w:tc>
+          <w:tcPr>
+            <w:tcW w:type="dxa" w:w="5600"/>
+            <w:tcMar>
+              <w:top w:type="dxa" w:w="40"/>
+              <w:left w:type="dxa" w:w="80"/>
+              <w:bottom w:type="dxa" w:w="40"/>
+              <w:right w:type="dxa" w:w="80"/>
+            </w:tcMar>
+          </w:tcPr>
+          <w:p>
+            <w:r>
+              <w:rPr>
+                <w:b w:val="false"/>
+                <w:bCs w:val="false"/>
+                <w:sz w:val="18"/>
+                <w:szCs w:val="18"/>
+              </w:rPr>
+              <w:t xml:space="preserve">2 dilapidations instructions a month by month 12; half the expert witness gap; ~15 commercial surveys; +6 party wall enquiries a month</w:t>
+            </w:r>
+          </w:p>
+        </w:tc>
+        <w:tc>
+          <w:tcPr>
+            <w:tcW w:type="dxa" w:w="1900"/>
             <w:tcMar>
               <w:top w:type="dxa" w:w="40"/>
               <w:left w:type="dxa" w:w="80"/>
@@ -914,461 +1047,11 @@
             </w:pPr>
             <w:r>
               <w:rPr>
-                <w:b w:val="false"/>
-                <w:bCs w:val="false"/>
-                <w:sz w:val="18"/>
-                <w:szCs w:val="18"/>
-              </w:rPr>
-              <w:t xml:space="preserve">£12k</w:t>
-            </w:r>
-          </w:p>
-        </w:tc>
-        <w:tc>
-          <w:tcPr>
-            <w:tcW w:type="dxa" w:w="1800"/>
-            <w:tcMar>
-              <w:top w:type="dxa" w:w="40"/>
-              <w:left w:type="dxa" w:w="80"/>
-              <w:bottom w:type="dxa" w:w="40"/>
-              <w:right w:type="dxa" w:w="80"/>
-            </w:tcMar>
-          </w:tcPr>
-          <w:p>
-            <w:pPr>
-              <w:jc w:val="right"/>
-            </w:pPr>
-            <w:r>
-              <w:rPr>
-                <w:b w:val="false"/>
-                <w:bCs w:val="false"/>
-                <w:sz w:val="18"/>
-                <w:szCs w:val="18"/>
-              </w:rPr>
-              <w:t xml:space="preserve">£36k</w:t>
-            </w:r>
-          </w:p>
-        </w:tc>
-        <w:tc>
-          <w:tcPr>
-            <w:tcW w:type="dxa" w:w="1800"/>
-            <w:tcMar>
-              <w:top w:type="dxa" w:w="40"/>
-              <w:left w:type="dxa" w:w="80"/>
-              <w:bottom w:type="dxa" w:w="40"/>
-              <w:right w:type="dxa" w:w="80"/>
-            </w:tcMar>
-          </w:tcPr>
-          <w:p>
-            <w:pPr>
-              <w:jc w:val="right"/>
-            </w:pPr>
-            <w:r>
-              <w:rPr>
-                <w:b w:val="false"/>
-                <w:bCs w:val="false"/>
-                <w:sz w:val="18"/>
-                <w:szCs w:val="18"/>
-              </w:rPr>
-              <w:t xml:space="preserve">£64k</w:t>
-            </w:r>
-          </w:p>
-        </w:tc>
-      </w:tr>
-      <w:tr>
-        <w:tc>
-          <w:tcPr>
-            <w:tcW w:type="dxa" w:w="3600"/>
-            <w:tcMar>
-              <w:top w:type="dxa" w:w="40"/>
-              <w:left w:type="dxa" w:w="80"/>
-              <w:bottom w:type="dxa" w:w="40"/>
-              <w:right w:type="dxa" w:w="80"/>
-            </w:tcMar>
-          </w:tcPr>
-          <w:p>
-            <w:r>
-              <w:rPr>
                 <w:b/>
                 <w:bCs/>
                 <w:sz w:val="18"/>
                 <w:szCs w:val="18"/>
               </w:rPr>
-              <w:t xml:space="preserve">Expert witness (share of the £150k gap)</w:t>
-            </w:r>
-          </w:p>
-        </w:tc>
-        <w:tc>
-          <w:tcPr>
-            <w:tcW w:type="dxa" w:w="1800"/>
-            <w:tcMar>
-              <w:top w:type="dxa" w:w="40"/>
-              <w:left w:type="dxa" w:w="80"/>
-              <w:bottom w:type="dxa" w:w="40"/>
-              <w:right w:type="dxa" w:w="80"/>
-            </w:tcMar>
-          </w:tcPr>
-          <w:p>
-            <w:pPr>
-              <w:jc w:val="right"/>
-            </w:pPr>
-            <w:r>
-              <w:rPr>
-                <w:b w:val="false"/>
-                <w:bCs w:val="false"/>
-                <w:sz w:val="18"/>
-                <w:szCs w:val="18"/>
-              </w:rPr>
-              <w:t xml:space="preserve">£15k</w:t>
-            </w:r>
-          </w:p>
-        </w:tc>
-        <w:tc>
-          <w:tcPr>
-            <w:tcW w:type="dxa" w:w="1800"/>
-            <w:tcMar>
-              <w:top w:type="dxa" w:w="40"/>
-              <w:left w:type="dxa" w:w="80"/>
-              <w:bottom w:type="dxa" w:w="40"/>
-              <w:right w:type="dxa" w:w="80"/>
-            </w:tcMar>
-          </w:tcPr>
-          <w:p>
-            <w:pPr>
-              <w:jc w:val="right"/>
-            </w:pPr>
-            <w:r>
-              <w:rPr>
-                <w:b w:val="false"/>
-                <w:bCs w:val="false"/>
-                <w:sz w:val="18"/>
-                <w:szCs w:val="18"/>
-              </w:rPr>
-              <w:t xml:space="preserve">£37k</w:t>
-            </w:r>
-          </w:p>
-        </w:tc>
-        <w:tc>
-          <w:tcPr>
-            <w:tcW w:type="dxa" w:w="1800"/>
-            <w:tcMar>
-              <w:top w:type="dxa" w:w="40"/>
-              <w:left w:type="dxa" w:w="80"/>
-              <w:bottom w:type="dxa" w:w="40"/>
-              <w:right w:type="dxa" w:w="80"/>
-            </w:tcMar>
-          </w:tcPr>
-          <w:p>
-            <w:pPr>
-              <w:jc w:val="right"/>
-            </w:pPr>
-            <w:r>
-              <w:rPr>
-                <w:b w:val="false"/>
-                <w:bCs w:val="false"/>
-                <w:sz w:val="18"/>
-                <w:szCs w:val="18"/>
-              </w:rPr>
-              <w:t xml:space="preserve">£75k</w:t>
-            </w:r>
-          </w:p>
-        </w:tc>
-      </w:tr>
-      <w:tr>
-        <w:tc>
-          <w:tcPr>
-            <w:tcW w:type="dxa" w:w="3600"/>
-            <w:tcMar>
-              <w:top w:type="dxa" w:w="40"/>
-              <w:left w:type="dxa" w:w="80"/>
-              <w:bottom w:type="dxa" w:w="40"/>
-              <w:right w:type="dxa" w:w="80"/>
-            </w:tcMar>
-          </w:tcPr>
-          <w:p>
-            <w:r>
-              <w:rPr>
-                <w:b/>
-                <w:bCs/>
-                <w:sz w:val="18"/>
-                <w:szCs w:val="18"/>
-              </w:rPr>
-              <w:t xml:space="preserve">Commercial building surveys</w:t>
-            </w:r>
-          </w:p>
-        </w:tc>
-        <w:tc>
-          <w:tcPr>
-            <w:tcW w:type="dxa" w:w="1800"/>
-            <w:tcMar>
-              <w:top w:type="dxa" w:w="40"/>
-              <w:left w:type="dxa" w:w="80"/>
-              <w:bottom w:type="dxa" w:w="40"/>
-              <w:right w:type="dxa" w:w="80"/>
-            </w:tcMar>
-          </w:tcPr>
-          <w:p>
-            <w:pPr>
-              <w:jc w:val="right"/>
-            </w:pPr>
-            <w:r>
-              <w:rPr>
-                <w:b w:val="false"/>
-                <w:bCs w:val="false"/>
-                <w:sz w:val="18"/>
-                <w:szCs w:val="18"/>
-              </w:rPr>
-              <w:t xml:space="preserve">£10k</w:t>
-            </w:r>
-          </w:p>
-        </w:tc>
-        <w:tc>
-          <w:tcPr>
-            <w:tcW w:type="dxa" w:w="1800"/>
-            <w:tcMar>
-              <w:top w:type="dxa" w:w="40"/>
-              <w:left w:type="dxa" w:w="80"/>
-              <w:bottom w:type="dxa" w:w="40"/>
-              <w:right w:type="dxa" w:w="80"/>
-            </w:tcMar>
-          </w:tcPr>
-          <w:p>
-            <w:pPr>
-              <w:jc w:val="right"/>
-            </w:pPr>
-            <w:r>
-              <w:rPr>
-                <w:b w:val="false"/>
-                <w:bCs w:val="false"/>
-                <w:sz w:val="18"/>
-                <w:szCs w:val="18"/>
-              </w:rPr>
-              <w:t xml:space="preserve">£22k</w:t>
-            </w:r>
-          </w:p>
-        </w:tc>
-        <w:tc>
-          <w:tcPr>
-            <w:tcW w:type="dxa" w:w="1800"/>
-            <w:tcMar>
-              <w:top w:type="dxa" w:w="40"/>
-              <w:left w:type="dxa" w:w="80"/>
-              <w:bottom w:type="dxa" w:w="40"/>
-              <w:right w:type="dxa" w:w="80"/>
-            </w:tcMar>
-          </w:tcPr>
-          <w:p>
-            <w:pPr>
-              <w:jc w:val="right"/>
-            </w:pPr>
-            <w:r>
-              <w:rPr>
-                <w:b w:val="false"/>
-                <w:bCs w:val="false"/>
-                <w:sz w:val="18"/>
-                <w:szCs w:val="18"/>
-              </w:rPr>
-              <w:t xml:space="preserve">£38k</w:t>
-            </w:r>
-          </w:p>
-        </w:tc>
-      </w:tr>
-      <w:tr>
-        <w:tc>
-          <w:tcPr>
-            <w:tcW w:type="dxa" w:w="3600"/>
-            <w:tcMar>
-              <w:top w:type="dxa" w:w="40"/>
-              <w:left w:type="dxa" w:w="80"/>
-              <w:bottom w:type="dxa" w:w="40"/>
-              <w:right w:type="dxa" w:w="80"/>
-            </w:tcMar>
-          </w:tcPr>
-          <w:p>
-            <w:r>
-              <w:rPr>
-                <w:b/>
-                <w:bCs/>
-                <w:sz w:val="18"/>
-                <w:szCs w:val="18"/>
-              </w:rPr>
-              <w:t xml:space="preserve">Party wall (Southampton + London)</w:t>
-            </w:r>
-          </w:p>
-        </w:tc>
-        <w:tc>
-          <w:tcPr>
-            <w:tcW w:type="dxa" w:w="1800"/>
-            <w:tcMar>
-              <w:top w:type="dxa" w:w="40"/>
-              <w:left w:type="dxa" w:w="80"/>
-              <w:bottom w:type="dxa" w:w="40"/>
-              <w:right w:type="dxa" w:w="80"/>
-            </w:tcMar>
-          </w:tcPr>
-          <w:p>
-            <w:pPr>
-              <w:jc w:val="right"/>
-            </w:pPr>
-            <w:r>
-              <w:rPr>
-                <w:b w:val="false"/>
-                <w:bCs w:val="false"/>
-                <w:sz w:val="18"/>
-                <w:szCs w:val="18"/>
-              </w:rPr>
-              <w:t xml:space="preserve">£16k</w:t>
-            </w:r>
-          </w:p>
-        </w:tc>
-        <w:tc>
-          <w:tcPr>
-            <w:tcW w:type="dxa" w:w="1800"/>
-            <w:tcMar>
-              <w:top w:type="dxa" w:w="40"/>
-              <w:left w:type="dxa" w:w="80"/>
-              <w:bottom w:type="dxa" w:w="40"/>
-              <w:right w:type="dxa" w:w="80"/>
-            </w:tcMar>
-          </w:tcPr>
-          <w:p>
-            <w:pPr>
-              <w:jc w:val="right"/>
-            </w:pPr>
-            <w:r>
-              <w:rPr>
-                <w:b w:val="false"/>
-                <w:bCs w:val="false"/>
-                <w:sz w:val="18"/>
-                <w:szCs w:val="18"/>
-              </w:rPr>
-              <w:t xml:space="preserve">£32k</w:t>
-            </w:r>
-          </w:p>
-        </w:tc>
-        <w:tc>
-          <w:tcPr>
-            <w:tcW w:type="dxa" w:w="1800"/>
-            <w:tcMar>
-              <w:top w:type="dxa" w:w="40"/>
-              <w:left w:type="dxa" w:w="80"/>
-              <w:bottom w:type="dxa" w:w="40"/>
-              <w:right w:type="dxa" w:w="80"/>
-            </w:tcMar>
-          </w:tcPr>
-          <w:p>
-            <w:pPr>
-              <w:jc w:val="right"/>
-            </w:pPr>
-            <w:r>
-              <w:rPr>
-                <w:b w:val="false"/>
-                <w:bCs w:val="false"/>
-                <w:sz w:val="18"/>
-                <w:szCs w:val="18"/>
-              </w:rPr>
-              <w:t xml:space="preserve">£49k</w:t>
-            </w:r>
-          </w:p>
-        </w:tc>
-      </w:tr>
-      <w:tr>
-        <w:tc>
-          <w:tcPr>
-            <w:tcW w:type="dxa" w:w="3600"/>
-            <w:shd w:fill="EDEFF5" w:val="clear"/>
-            <w:tcMar>
-              <w:top w:type="dxa" w:w="40"/>
-              <w:left w:type="dxa" w:w="80"/>
-              <w:bottom w:type="dxa" w:w="40"/>
-              <w:right w:type="dxa" w:w="80"/>
-            </w:tcMar>
-          </w:tcPr>
-          <w:p>
-            <w:r>
-              <w:rPr>
-                <w:b/>
-                <w:bCs/>
-                <w:sz w:val="18"/>
-                <w:szCs w:val="18"/>
-              </w:rPr>
-              <w:t xml:space="preserve">Total new revenue</w:t>
-            </w:r>
-          </w:p>
-        </w:tc>
-        <w:tc>
-          <w:tcPr>
-            <w:tcW w:type="dxa" w:w="1800"/>
-            <w:shd w:fill="EDEFF5" w:val="clear"/>
-            <w:tcMar>
-              <w:top w:type="dxa" w:w="40"/>
-              <w:left w:type="dxa" w:w="80"/>
-              <w:bottom w:type="dxa" w:w="40"/>
-              <w:right w:type="dxa" w:w="80"/>
-            </w:tcMar>
-          </w:tcPr>
-          <w:p>
-            <w:pPr>
-              <w:jc w:val="right"/>
-            </w:pPr>
-            <w:r>
-              <w:rPr>
-                <w:b/>
-                <w:bCs/>
-                <w:sz w:val="18"/>
-                <w:szCs w:val="18"/>
-              </w:rPr>
-              <w:t xml:space="preserve">~£53k</w:t>
-            </w:r>
-          </w:p>
-        </w:tc>
-        <w:tc>
-          <w:tcPr>
-            <w:tcW w:type="dxa" w:w="1800"/>
-            <w:shd w:fill="EDEFF5" w:val="clear"/>
-            <w:tcMar>
-              <w:top w:type="dxa" w:w="40"/>
-              <w:left w:type="dxa" w:w="80"/>
-              <w:bottom w:type="dxa" w:w="40"/>
-              <w:right w:type="dxa" w:w="80"/>
-            </w:tcMar>
-          </w:tcPr>
-          <w:p>
-            <w:pPr>
-              <w:jc w:val="right"/>
-            </w:pPr>
-            <w:r>
-              <w:rPr>
-                <w:b/>
-                <w:bCs/>
-                <w:sz w:val="18"/>
-                <w:szCs w:val="18"/>
-              </w:rPr>
-              <w:t xml:space="preserve">~£128k</w:t>
-            </w:r>
-          </w:p>
-        </w:tc>
-        <w:tc>
-          <w:tcPr>
-            <w:tcW w:type="dxa" w:w="1800"/>
-            <w:shd w:fill="EDEFF5" w:val="clear"/>
-            <w:tcMar>
-              <w:top w:type="dxa" w:w="40"/>
-              <w:left w:type="dxa" w:w="80"/>
-              <w:bottom w:type="dxa" w:w="40"/>
-              <w:right w:type="dxa" w:w="80"/>
-            </w:tcMar>
-          </w:tcPr>
-          <w:p>
-            <w:pPr>
-              <w:jc w:val="right"/>
-            </w:pPr>
-            <w:r>
-              <w:rPr>
-                <w:b/>
-                <w:bCs/>
-                <w:sz w:val="18"/>
-                <w:szCs w:val="18"/>
-              </w:rPr>
               <w:t xml:space="preserve">~£225k</w:t>
             </w:r>
           </w:p>
@@ -1397,7 +1080,7 @@
           <w:sz w:val="19"/>
           <w:szCs w:val="19"/>
         </w:rPr>
-        <w:t xml:space="preserve">Two honest notes on margin. First, these are year-one figures while the pages climb; the same pages keep producing in year two without being rebuilt — this is an asset build, not a spend. Second, a blended 20% net margin includes all of your fixed costs; an additional instruction into existing capacity contributes at a much higher rate than 20%, and the high-value lines above are exactly the work where that is true.</w:t>
+        <w:t xml:space="preserve">Two honest notes. First, on capacity and margin: the realistic case is sized to fit within the existing team — the expert witness opportunity in particular is one individual's caseload. Work the team absorbs without hiring only costs the time spent delivering it, so each extra instruction keeps far more than the firm's overall 20% — the rent and salaries are already paid. The stretch case is the point where a hire enters the picture, and that decision would be made from the day-90 evidence, not in advance. Second, these are year-one figures while the pages climb; the same pages keep producing in year two without being rebuilt — this is an asset build, not a spend.</w:t>
       </w:r>
     </w:p>
     <w:sectPr>

</xml_diff>

<commit_message>
Revise two-pager: Content Studio delivery model, commercial-layer language, house style
Co-Authored-By: Claude Fable 5 <noreply@anthropic.com>
Claude-Session: https://claude.ai/code/session_015m2wC9de21Ykdh6niNZrqh
</commit_message>
<xml_diff>
--- a/HarrisonClarke-First-90-Days.docx
+++ b/HarrisonClarke-First-90-Days.docx
@@ -27,7 +27,7 @@
           <w:sz w:val="22"/>
           <w:szCs w:val="22"/>
         </w:rPr>
-        <w:t xml:space="preserve">The first 90 days — what we would do, what we would need, and what changes for your team</w:t>
+        <w:t xml:space="preserve">The first 90 days: what we would do, what we would need, and what changes for your team</w:t>
       </w:r>
     </w:p>
     <w:p>
@@ -39,7 +39,7 @@
           <w:sz w:val="19"/>
           <w:szCs w:val="19"/>
         </w:rPr>
-        <w:t xml:space="preserve">This is a defined 90-day sprint with an off-ramp, not an open-ended retainer. Its single job is to point the content engine you have already built — the reviews, the blog library, Holly’s production capacity — at your highest-value work: dilapidations (especially London), expert witness, commercial building surveys and party wall. Residential enquiries will still come, but they are a byproduct, not the target. Nothing here replaces your internal marketing; it feeds it.</w:t>
+        <w:t xml:space="preserve">This is a defined 90-day project with a review and an off-ramp at the end. Its aim is to build a commercial layer on top of the content engine you have already created: dedicated, properly targeted pages for your highest-value services, meaning dilapidations (especially London), expert witness, commercial building surveys and party wall. Residential enquiries will continue to arrive as a welcome side effect. We write the content in our Content Studio platform, which makes capturing your team's knowledge straightforward and turns sign-offs into checking an email.</w:t>
       </w:r>
     </w:p>
     <w:p>
@@ -81,7 +81,7 @@
           <w:sz w:val="20"/>
           <w:szCs w:val="20"/>
         </w:rPr>
-        <w:t xml:space="preserve">  Aim — point everything at the money</w:t>
+        <w:t xml:space="preserve">  Set the targets</w:t>
       </w:r>
     </w:p>
     <w:p>
@@ -115,58 +115,58 @@
           <w:sz w:val="19"/>
           <w:szCs w:val="19"/>
         </w:rPr>
-        <w:t xml:space="preserve">Written briefs for the money pages: a new “Dilapidations Survey London” service page, and re-targeted expert witness, commercial building survey, schedule of dilapidations and party wall pages.</w:t>
-      </w:r>
-    </w:p>
-    <w:p>
-      <w:pPr>
-        <w:pStyle w:val="ListParagraph"/>
-        <w:numPr>
-          <w:ilvl w:val="0"/>
-          <w:numId w:val="2"/>
-        </w:numPr>
-        <w:spacing w:after="40"/>
-      </w:pPr>
-      <w:r>
-        <w:rPr>
-          <w:sz w:val="19"/>
-          <w:szCs w:val="19"/>
-        </w:rPr>
-        <w:t xml:space="preserve">Internal link plan: your blog guides already rank — we wire their authority into the service pages they should be selling for.</w:t>
-      </w:r>
-    </w:p>
-    <w:p>
-      <w:pPr>
-        <w:pStyle w:val="ListParagraph"/>
-        <w:numPr>
-          <w:ilvl w:val="0"/>
-          <w:numId w:val="2"/>
-        </w:numPr>
-        <w:spacing w:after="40"/>
-      </w:pPr>
-      <w:r>
-        <w:rPr>
-          <w:sz w:val="19"/>
-          <w:szCs w:val="19"/>
-        </w:rPr>
-        <w:t xml:space="preserve">Housekeeping from the domain migration (e.g. Trustpilot still points at the old .co address) — small fixes that also improve how AI tools describe you.</w:t>
-      </w:r>
-    </w:p>
-    <w:p>
-      <w:pPr>
-        <w:pStyle w:val="ListParagraph"/>
-        <w:numPr>
-          <w:ilvl w:val="0"/>
-          <w:numId w:val="2"/>
-        </w:numPr>
-        <w:spacing w:after="40"/>
-      </w:pPr>
-      <w:r>
-        <w:rPr>
-          <w:sz w:val="19"/>
-          <w:szCs w:val="19"/>
-        </w:rPr>
-        <w:t xml:space="preserve">Measurement first: baseline rankings and an enquiry-attribution set-up designed with Holly, so every enquiry is tagged by source and service line from day one.</w:t>
+        <w:t xml:space="preserve">First drafts begin in Content Studio: a new Dilapidations Survey London page, then re-targeted expert witness, commercial building survey, schedule of dilapidations and party wall pages.</w:t>
+      </w:r>
+    </w:p>
+    <w:p>
+      <w:pPr>
+        <w:pStyle w:val="ListParagraph"/>
+        <w:numPr>
+          <w:ilvl w:val="0"/>
+          <w:numId w:val="2"/>
+        </w:numPr>
+        <w:spacing w:after="40"/>
+      </w:pPr>
+      <w:r>
+        <w:rPr>
+          <w:sz w:val="19"/>
+          <w:szCs w:val="19"/>
+        </w:rPr>
+        <w:t xml:space="preserve">Internal link plan: your blog guides already rank well, so we connect their authority to the commercial pages they should be supporting.</w:t>
+      </w:r>
+    </w:p>
+    <w:p>
+      <w:pPr>
+        <w:pStyle w:val="ListParagraph"/>
+        <w:numPr>
+          <w:ilvl w:val="0"/>
+          <w:numId w:val="2"/>
+        </w:numPr>
+        <w:spacing w:after="40"/>
+      </w:pPr>
+      <w:r>
+        <w:rPr>
+          <w:sz w:val="19"/>
+          <w:szCs w:val="19"/>
+        </w:rPr>
+        <w:t xml:space="preserve">Housekeeping from the domain migration, such as the Trustpilot listing that still points at the old .co address. Small fixes that also improve how AI tools describe you.</w:t>
+      </w:r>
+    </w:p>
+    <w:p>
+      <w:pPr>
+        <w:pStyle w:val="ListParagraph"/>
+        <w:numPr>
+          <w:ilvl w:val="0"/>
+          <w:numId w:val="2"/>
+        </w:numPr>
+        <w:spacing w:after="40"/>
+      </w:pPr>
+      <w:r>
+        <w:rPr>
+          <w:sz w:val="19"/>
+          <w:szCs w:val="19"/>
+        </w:rPr>
+        <w:t xml:space="preserve">Measurement first: baseline rankings, and enquiry tracking by source and service line set up with Holly before any content changes.</w:t>
       </w:r>
     </w:p>
     <w:p>
@@ -181,7 +181,7 @@
           <w:sz w:val="19"/>
           <w:szCs w:val="19"/>
         </w:rPr>
-        <w:t xml:space="preserve">End of month 1: the targeting map agreed, the first briefs in Holly’s hands, tracking live.</w:t>
+        <w:t xml:space="preserve">End of month 1: targets agreed, first drafts in review, tracking live.</w:t>
       </w:r>
     </w:p>
     <w:p>
@@ -205,58 +205,58 @@
           <w:sz w:val="20"/>
           <w:szCs w:val="20"/>
         </w:rPr>
-        <w:t xml:space="preserve">  Build — publish the pages that sell</w:t>
-      </w:r>
-    </w:p>
-    <w:p>
-      <w:pPr>
-        <w:pStyle w:val="ListParagraph"/>
-        <w:numPr>
-          <w:ilvl w:val="0"/>
-          <w:numId w:val="2"/>
-        </w:numPr>
-        <w:spacing w:after="40"/>
-      </w:pPr>
-      <w:r>
-        <w:rPr>
-          <w:sz w:val="19"/>
-          <w:szCs w:val="19"/>
-        </w:rPr>
-        <w:t xml:space="preserve">Holly publishes the rewritten money pages from our briefs; we quality-check each one before and after it goes live.</w:t>
-      </w:r>
-    </w:p>
-    <w:p>
-      <w:pPr>
-        <w:pStyle w:val="ListParagraph"/>
-        <w:numPr>
-          <w:ilvl w:val="0"/>
-          <w:numId w:val="2"/>
-        </w:numPr>
-        <w:spacing w:after="40"/>
-      </w:pPr>
-      <w:r>
-        <w:rPr>
-          <w:sz w:val="19"/>
-          <w:szCs w:val="19"/>
-        </w:rPr>
-        <w:t xml:space="preserve">The London dilapidations page goes live, supported by the blog post that already ranks for it.</w:t>
-      </w:r>
-    </w:p>
-    <w:p>
-      <w:pPr>
-        <w:pStyle w:val="ListParagraph"/>
-        <w:numPr>
-          <w:ilvl w:val="0"/>
-          <w:numId w:val="2"/>
-        </w:numPr>
-        <w:spacing w:after="40"/>
-      </w:pPr>
-      <w:r>
-        <w:rPr>
-          <w:sz w:val="19"/>
-          <w:szCs w:val="19"/>
-        </w:rPr>
-        <w:t xml:space="preserve">Cost and pricing content for the high-value lines (party wall cost, dilapidations costs) — the “They Ask, You Answer” pillar the site has never had, on queries your Search Console already shows thousands of impressions for.</w:t>
+        <w:t xml:space="preserve">  Build the commercial layer</w:t>
+      </w:r>
+    </w:p>
+    <w:p>
+      <w:pPr>
+        <w:pStyle w:val="ListParagraph"/>
+        <w:numPr>
+          <w:ilvl w:val="0"/>
+          <w:numId w:val="2"/>
+        </w:numPr>
+        <w:spacing w:after="40"/>
+      </w:pPr>
+      <w:r>
+        <w:rPr>
+          <w:sz w:val="19"/>
+          <w:szCs w:val="19"/>
+        </w:rPr>
+        <w:t xml:space="preserve">We write, you approve: each page is drafted in Content Studio, signed off from your inbox, and published (by us or by Holly, whichever suits your set-up).</w:t>
+      </w:r>
+    </w:p>
+    <w:p>
+      <w:pPr>
+        <w:pStyle w:val="ListParagraph"/>
+        <w:numPr>
+          <w:ilvl w:val="0"/>
+          <w:numId w:val="2"/>
+        </w:numPr>
+        <w:spacing w:after="40"/>
+      </w:pPr>
+      <w:r>
+        <w:rPr>
+          <w:sz w:val="19"/>
+          <w:szCs w:val="19"/>
+        </w:rPr>
+        <w:t xml:space="preserve">The London dilapidations page goes live, supported by the blog post that already ranks for the phrase.</w:t>
+      </w:r>
+    </w:p>
+    <w:p>
+      <w:pPr>
+        <w:pStyle w:val="ListParagraph"/>
+        <w:numPr>
+          <w:ilvl w:val="0"/>
+          <w:numId w:val="2"/>
+        </w:numPr>
+        <w:spacing w:after="40"/>
+      </w:pPr>
+      <w:r>
+        <w:rPr>
+          <w:sz w:val="19"/>
+          <w:szCs w:val="19"/>
+        </w:rPr>
+        <w:t xml:space="preserve">Cost and pricing content for the high-value lines, starting with party wall and dilapidations costs. This is the They Ask, You Answer pillar the site has never had, and your own Search Console shows thousands of impressions on these queries.</w:t>
       </w:r>
     </w:p>
     <w:p>
@@ -290,7 +290,7 @@
           <w:sz w:val="19"/>
           <w:szCs w:val="19"/>
         </w:rPr>
-        <w:t xml:space="preserve">Second batch of briefs; London Google Business Profile and review push started.</w:t>
+        <w:t xml:space="preserve">London Google Business Profile and review push started.</w:t>
       </w:r>
     </w:p>
     <w:p>
@@ -305,7 +305,7 @@
           <w:sz w:val="19"/>
           <w:szCs w:val="19"/>
         </w:rPr>
-        <w:t xml:space="preserve">End of month 2: every priority page live on the right target; first ranking movement measurable.</w:t>
+        <w:t xml:space="preserve">End of month 2: the priority pages live on the right targets, with first movement measurable.</w:t>
       </w:r>
     </w:p>
     <w:p>
@@ -329,58 +329,58 @@
           <w:sz w:val="20"/>
           <w:szCs w:val="20"/>
         </w:rPr>
-        <w:t xml:space="preserve">  Prove — evidence, then a decision</w:t>
-      </w:r>
-    </w:p>
-    <w:p>
-      <w:pPr>
-        <w:pStyle w:val="ListParagraph"/>
-        <w:numPr>
-          <w:ilvl w:val="0"/>
-          <w:numId w:val="2"/>
-        </w:numPr>
-        <w:spacing w:after="40"/>
-      </w:pPr>
-      <w:r>
-        <w:rPr>
-          <w:sz w:val="19"/>
-          <w:szCs w:val="19"/>
-        </w:rPr>
-        <w:t xml:space="preserve">Commercial survey / technical due diligence content and the remaining briefs.</w:t>
-      </w:r>
-    </w:p>
-    <w:p>
-      <w:pPr>
-        <w:pStyle w:val="ListParagraph"/>
-        <w:numPr>
-          <w:ilvl w:val="0"/>
-          <w:numId w:val="2"/>
-        </w:numPr>
-        <w:spacing w:after="40"/>
-      </w:pPr>
-      <w:r>
-        <w:rPr>
-          <w:sz w:val="19"/>
-          <w:szCs w:val="19"/>
-        </w:rPr>
-        <w:t xml:space="preserve">Rank and enquiry review against the month-1 baseline, service line by service line.</w:t>
-      </w:r>
-    </w:p>
-    <w:p>
-      <w:pPr>
-        <w:pStyle w:val="ListParagraph"/>
-        <w:numPr>
-          <w:ilvl w:val="0"/>
-          <w:numId w:val="2"/>
-        </w:numPr>
-        <w:spacing w:after="40"/>
-      </w:pPr>
-      <w:r>
-        <w:rPr>
-          <w:sz w:val="19"/>
-          <w:szCs w:val="19"/>
-        </w:rPr>
-        <w:t xml:space="preserve">Day-90 review with Tim and Faye: what moved, what it is worth on your own fees and close rates, and a keep/stop decision made from evidence — the off-ramp is real.</w:t>
+        <w:t xml:space="preserve">  Prove it</w:t>
+      </w:r>
+    </w:p>
+    <w:p>
+      <w:pPr>
+        <w:pStyle w:val="ListParagraph"/>
+        <w:numPr>
+          <w:ilvl w:val="0"/>
+          <w:numId w:val="2"/>
+        </w:numPr>
+        <w:spacing w:after="40"/>
+      </w:pPr>
+      <w:r>
+        <w:rPr>
+          <w:sz w:val="19"/>
+          <w:szCs w:val="19"/>
+        </w:rPr>
+        <w:t xml:space="preserve">Commercial survey and technical due diligence content, plus the remaining pages.</w:t>
+      </w:r>
+    </w:p>
+    <w:p>
+      <w:pPr>
+        <w:pStyle w:val="ListParagraph"/>
+        <w:numPr>
+          <w:ilvl w:val="0"/>
+          <w:numId w:val="2"/>
+        </w:numPr>
+        <w:spacing w:after="40"/>
+      </w:pPr>
+      <w:r>
+        <w:rPr>
+          <w:sz w:val="19"/>
+          <w:szCs w:val="19"/>
+        </w:rPr>
+        <w:t xml:space="preserve">Rank and enquiry review against the month 1 baseline, service line by service line.</w:t>
+      </w:r>
+    </w:p>
+    <w:p>
+      <w:pPr>
+        <w:pStyle w:val="ListParagraph"/>
+        <w:numPr>
+          <w:ilvl w:val="0"/>
+          <w:numId w:val="2"/>
+        </w:numPr>
+        <w:spacing w:after="40"/>
+      </w:pPr>
+      <w:r>
+        <w:rPr>
+          <w:sz w:val="19"/>
+          <w:szCs w:val="19"/>
+        </w:rPr>
+        <w:t xml:space="preserve">Day-90 review with Tim and Faye: what moved, what it is worth on your own fees and close rates, and a decision on whether to continue. The off-ramp is real.</w:t>
       </w:r>
     </w:p>
     <w:p>
@@ -395,7 +395,7 @@
           <w:sz w:val="19"/>
           <w:szCs w:val="19"/>
         </w:rPr>
-        <w:t xml:space="preserve">End of month 3: a decision based on your numbers, not our promises.</w:t>
+        <w:t xml:space="preserve">End of month 3: a decision based on evidence.</w:t>
       </w:r>
     </w:p>
     <w:p>
@@ -472,7 +472,7 @@
                 <w:sz w:val="18"/>
                 <w:szCs w:val="18"/>
               </w:rPr>
-              <w:t xml:space="preserve">Google Search Console, Analytics, the website CMS, Hike, Google Business Profiles, and wherever enquiries land (inbox/CRM). One short kick-off call.</w:t>
+              <w:t xml:space="preserve">Google Search Console, Analytics, the website CMS, Hike, Google Business Profiles, and wherever enquiries land (inbox or CRM). One short kick-off call.</w:t>
             </w:r>
           </w:p>
         </w:tc>
@@ -517,7 +517,7 @@
                 <w:sz w:val="18"/>
                 <w:szCs w:val="18"/>
               </w:rPr>
-              <w:t xml:space="preserve">2–3 hours a week: publishing pages and posts from our briefs, gathering service details, chasing sign-offs. She stays the owner of content and social.</w:t>
+              <w:t xml:space="preserve">Two to three hours a week. Content Studio makes this light: she answers guided questions about each service so we can write accurately, reviews drafts from her inbox, and pushes approved content live if you would rather publishing stayed in house.</w:t>
             </w:r>
           </w:p>
         </w:tc>
@@ -562,7 +562,7 @@
                 <w:sz w:val="18"/>
                 <w:szCs w:val="18"/>
               </w:rPr>
-              <w:t xml:space="preserve">30–45 minutes a month: technical sign-off on service-page copy (RICS accuracy), plus London and expert-witness case examples and testimonials we can quote.</w:t>
+              <w:t xml:space="preserve">Thirty to forty-five minutes a month for technical sign-off on service page copy (RICS accuracy), plus London and expert witness case examples and testimonials we can quote. Sign-off arrives by email through Content Studio.</w:t>
             </w:r>
           </w:p>
         </w:tc>
@@ -607,7 +607,7 @@
                 <w:sz w:val="18"/>
                 <w:szCs w:val="18"/>
               </w:rPr>
-              <w:t xml:space="preserve">Monthly enquiry counts by service line (even rough ones). This is what lets us report in instructions and fees rather than rankings.</w:t>
+              <w:t xml:space="preserve">Monthly enquiry counts by service line, even rough ones. This is what lets us report in instructions and fees rather than rankings.</w:t>
             </w:r>
           </w:p>
         </w:tc>
@@ -659,65 +659,65 @@
           <w:sz w:val="19"/>
           <w:szCs w:val="19"/>
         </w:rPr>
-        <w:t xml:space="preserve">Roughly 10 hours a week of SEO comes off her plate </w:t>
-      </w:r>
-      <w:r>
-        <w:rPr>
-          <w:sz w:val="19"/>
-          <w:szCs w:val="19"/>
-        </w:rPr>
-        <w:t xml:space="preserve">— the keyword research, targeting decisions and Hike interpretation that are a specialist’s job, not a fair ask of someone running all of marketing.</w:t>
-      </w:r>
-    </w:p>
-    <w:p>
-      <w:pPr>
-        <w:pStyle w:val="ListParagraph"/>
-        <w:numPr>
-          <w:ilvl w:val="0"/>
-          <w:numId w:val="2"/>
-        </w:numPr>
-        <w:spacing w:after="40"/>
-      </w:pPr>
-      <w:r>
-        <w:rPr>
-          <w:sz w:val="19"/>
-          <w:szCs w:val="19"/>
-        </w:rPr>
-        <w:t xml:space="preserve">She receives ready-made briefs — target phrase, page structure, internal links — and keeps full ownership of writing, publishing and social. Her involvement drops to 2–3 hours a week: gathering information, sign-offs, and pushing content live.</w:t>
-      </w:r>
-    </w:p>
-    <w:p>
-      <w:pPr>
-        <w:pStyle w:val="ListParagraph"/>
-        <w:numPr>
-          <w:ilvl w:val="0"/>
-          <w:numId w:val="2"/>
-        </w:numPr>
-        <w:spacing w:after="40"/>
-      </w:pPr>
-      <w:r>
-        <w:rPr>
-          <w:sz w:val="19"/>
-          <w:szCs w:val="19"/>
-        </w:rPr>
-        <w:t xml:space="preserve">The attribution set-up is built for her as much as for us: when an enquiry becomes an instruction, the report shows which page produced it — visible proof of her impact, in fees rather than traffic.</w:t>
-      </w:r>
-    </w:p>
-    <w:p>
-      <w:pPr>
-        <w:pStyle w:val="ListParagraph"/>
-        <w:numPr>
-          <w:ilvl w:val="0"/>
-          <w:numId w:val="2"/>
-        </w:numPr>
-        <w:spacing w:after="40"/>
-      </w:pPr>
-      <w:r>
-        <w:rPr>
-          <w:sz w:val="19"/>
-          <w:szCs w:val="19"/>
-        </w:rPr>
-        <w:t xml:space="preserve">Nothing she has built is discarded. The blog library is the asset that makes this plan work; we are re-aiming it, not replacing it.</w:t>
+        <w:t xml:space="preserve">Around 10 hours a week of SEO work comes off her plate</w:t>
+      </w:r>
+      <w:r>
+        <w:rPr>
+          <w:sz w:val="19"/>
+          <w:szCs w:val="19"/>
+        </w:rPr>
+        <w:t xml:space="preserve">: the keyword research, the targeting decisions, the interpretation of Hike, and the writing itself.</w:t>
+      </w:r>
+    </w:p>
+    <w:p>
+      <w:pPr>
+        <w:pStyle w:val="ListParagraph"/>
+        <w:numPr>
+          <w:ilvl w:val="0"/>
+          <w:numId w:val="2"/>
+        </w:numPr>
+        <w:spacing w:after="40"/>
+      </w:pPr>
+      <w:r>
+        <w:rPr>
+          <w:sz w:val="19"/>
+          <w:szCs w:val="19"/>
+        </w:rPr>
+        <w:t xml:space="preserve">Her role becomes knowledge capture and sign-off, and Content Studio is built to make both easy. She supplies service knowledge through guided questions, and approvals arrive in her inbox. In practice this is two to three hours a week.</w:t>
+      </w:r>
+    </w:p>
+    <w:p>
+      <w:pPr>
+        <w:pStyle w:val="ListParagraph"/>
+        <w:numPr>
+          <w:ilvl w:val="0"/>
+          <w:numId w:val="2"/>
+        </w:numPr>
+        <w:spacing w:after="40"/>
+      </w:pPr>
+      <w:r>
+        <w:rPr>
+          <w:sz w:val="19"/>
+          <w:szCs w:val="19"/>
+        </w:rPr>
+        <w:t xml:space="preserve">She keeps full ownership of social media and the wider marketing calendar, and when the tracking shows which pages produced instructions, that evidence of impact is hers to present.</w:t>
+      </w:r>
+    </w:p>
+    <w:p>
+      <w:pPr>
+        <w:pStyle w:val="ListParagraph"/>
+        <w:numPr>
+          <w:ilvl w:val="0"/>
+          <w:numId w:val="2"/>
+        </w:numPr>
+        <w:spacing w:after="40"/>
+      </w:pPr>
+      <w:r>
+        <w:rPr>
+          <w:sz w:val="19"/>
+          <w:szCs w:val="19"/>
+        </w:rPr>
+        <w:t xml:space="preserve">The blog library she has built is the foundation of this plan and stays exactly where it is. The work connects it to a commercial layer that has been missing.</w:t>
       </w:r>
     </w:p>
     <w:p>
@@ -735,7 +735,7 @@
           <w:sz w:val="24"/>
           <w:szCs w:val="24"/>
         </w:rPr>
-        <w:t xml:space="preserve">What it is worth (on your figures, not ours)</w:t>
+        <w:t xml:space="preserve">What it is worth (on your figures)</w:t>
       </w:r>
     </w:p>
     <w:p>
@@ -747,7 +747,7 @@
           <w:sz w:val="19"/>
           <w:szCs w:val="19"/>
         </w:rPr>
-        <w:t xml:space="preserve">Every number below uses the fees and close rates Tim gave us — dilapidations instructions at £2,500–£8,000, expert witness against the £150k Southampton gap Tim has already quantified, commercial surveys at £2,500 average, party wall converting 1 enquiry in 2 at ~£1,350 per award. Residential work is excluded from the targets; anything it adds is upside.</w:t>
+        <w:t xml:space="preserve">Every number below uses the fees and close rates Tim gave us: dilapidations instructions at £2,500 to £8,000, expert witness measured against the £150k Southampton gap Tim has already quantified, commercial surveys at £2,500 on average, and party wall converting one enquiry in two at around £1,350 per award. Residential work is excluded from the targets, so anything it adds is on top.</w:t>
       </w:r>
     </w:p>
     <w:tbl>
@@ -885,7 +885,7 @@
                 <w:sz w:val="18"/>
                 <w:szCs w:val="18"/>
               </w:rPr>
-              <w:t xml:space="preserve">1 dilapidations instruction a quarter; 1 commercial survey a quarter; a tenth of the expert witness gap; +2 party wall enquiries a month</w:t>
+              <w:t xml:space="preserve">1 dilapidations instruction a quarter; 1 commercial survey a quarter; a tenth of the expert witness gap; 2 extra party wall enquiries a month</w:t>
             </w:r>
           </w:p>
         </w:tc>
@@ -956,7 +956,7 @@
                 <w:sz w:val="18"/>
                 <w:szCs w:val="18"/>
               </w:rPr>
-              <w:t xml:space="preserve">~1 London dilapidations instruction a month; ~1 commercial survey a month; a quarter of the expert witness gap; +4 party wall enquiries a month</w:t>
+              <w:t xml:space="preserve">Around 1 London dilapidations instruction a month; around 1 commercial survey a month; a quarter of the expert witness gap; 4 extra party wall enquiries a month</w:t>
             </w:r>
           </w:p>
         </w:tc>
@@ -1027,7 +1027,7 @@
                 <w:sz w:val="18"/>
                 <w:szCs w:val="18"/>
               </w:rPr>
-              <w:t xml:space="preserve">2 dilapidations instructions a month by month 12; half the expert witness gap; ~15 commercial surveys; +6 party wall enquiries a month</w:t>
+              <w:t xml:space="preserve">2 dilapidations instructions a month by month 12; half the expert witness gap; around 15 commercial surveys; 6 extra party wall enquiries a month</w:t>
             </w:r>
           </w:p>
         </w:tc>
@@ -1080,7 +1080,7 @@
           <w:sz w:val="19"/>
           <w:szCs w:val="19"/>
         </w:rPr>
-        <w:t xml:space="preserve">Two honest notes. First, on capacity and margin: the realistic case is sized to fit within the existing team — the expert witness opportunity in particular is one individual's caseload. Work the team absorbs without hiring only costs the time spent delivering it, so each extra instruction keeps far more than the firm's overall 20% — the rent and salaries are already paid. The stretch case is the point where a hire enters the picture, and that decision would be made from the day-90 evidence, not in advance. Second, these are year-one figures while the pages climb; the same pages keep producing in year two without being rebuilt — this is an asset build, not a spend.</w:t>
+        <w:t xml:space="preserve">Two notes on these numbers. The realistic case is sized to fit within your existing team; the expert witness opportunity in particular is one individual's caseload. Work the team absorbs without hiring only costs the time spent delivering it, so each additional instruction keeps considerably more than the firm's overall 20%, because the rent and the salaries are already covered. The stretch case is the point where a hire would enter the picture, and the day-90 evidence is the right basis for that decision. Finally, these are year-one figures while the pages climb; the same pages continue to produce in year two without further build cost.</w:t>
       </w:r>
     </w:p>
     <w:sectPr>

</xml_diff>

<commit_message>
Raise scenario targets: landlord-weighted dilaps, EW gap fractions, month-12 run-rate
Co-Authored-By: Claude Fable 5 <noreply@anthropic.com>
Claude-Session: https://claude.ai/code/session_015m2wC9de21Ykdh6niNZrqh
</commit_message>
<xml_diff>
--- a/HarrisonClarke-First-90-Days.docx
+++ b/HarrisonClarke-First-90-Days.docx
@@ -885,7 +885,7 @@
                 <w:sz w:val="18"/>
                 <w:szCs w:val="18"/>
               </w:rPr>
-              <w:t xml:space="preserve">1 dilapidations instruction a quarter; 1 commercial survey a quarter; a tenth of the expert witness gap; 2 extra party wall enquiries a month</w:t>
+              <w:t xml:space="preserve">1 dilapidations instruction a month from month 6; 6 commercial surveys; 15% of the expert witness gap; 2 extra party wall enquiries a month</w:t>
             </w:r>
           </w:p>
         </w:tc>
@@ -910,7 +910,7 @@
                 <w:sz w:val="18"/>
                 <w:szCs w:val="18"/>
               </w:rPr>
-              <w:t xml:space="preserve">~£53k</w:t>
+              <w:t xml:space="preserve">~£75k</w:t>
             </w:r>
           </w:p>
         </w:tc>
@@ -956,7 +956,7 @@
                 <w:sz w:val="18"/>
                 <w:szCs w:val="18"/>
               </w:rPr>
-              <w:t xml:space="preserve">Around 1 London dilapidations instruction a month; around 1 commercial survey a month; a quarter of the expert witness gap; 4 extra party wall enquiries a month</w:t>
+              <w:t xml:space="preserve">1 to 1.5 London dilapidations instructions a month; 1 commercial survey a month; a third of the expert witness gap; 4 extra party wall enquiries a month</w:t>
             </w:r>
           </w:p>
         </w:tc>
@@ -981,7 +981,7 @@
                 <w:sz w:val="18"/>
                 <w:szCs w:val="18"/>
               </w:rPr>
-              <w:t xml:space="preserve">~£128k</w:t>
+              <w:t xml:space="preserve">~£170k</w:t>
             </w:r>
           </w:p>
         </w:tc>
@@ -1027,7 +1027,7 @@
                 <w:sz w:val="18"/>
                 <w:szCs w:val="18"/>
               </w:rPr>
-              <w:t xml:space="preserve">2 dilapidations instructions a month by month 12; half the expert witness gap; around 15 commercial surveys; 6 extra party wall enquiries a month</w:t>
+              <w:t xml:space="preserve">2 dilapidations instructions a month; two-thirds of the expert witness gap, or half plus one complex case; 18 commercial surveys; 8 extra party wall enquiries a month with London contributing</w:t>
             </w:r>
           </w:p>
         </w:tc>
@@ -1052,7 +1052,7 @@
                 <w:sz w:val="18"/>
                 <w:szCs w:val="18"/>
               </w:rPr>
-              <w:t xml:space="preserve">~£225k</w:t>
+              <w:t xml:space="preserve">~£300k</w:t>
             </w:r>
           </w:p>
         </w:tc>
@@ -1072,6 +1072,18 @@
     </w:p>
     <w:p>
       <w:pPr>
+        <w:spacing w:after="80"/>
+      </w:pPr>
+      <w:r>
+        <w:rPr>
+          <w:sz w:val="19"/>
+          <w:szCs w:val="19"/>
+        </w:rPr>
+        <w:t xml:space="preserve">These are first-year totals, and the early months are build time. By month 12 the realistic case is running at roughly £185k a year.</w:t>
+      </w:r>
+    </w:p>
+    <w:p>
+      <w:pPr>
         <w:spacing w:after="0"/>
       </w:pPr>
       <w:r>
@@ -1080,7 +1092,7 @@
           <w:sz w:val="19"/>
           <w:szCs w:val="19"/>
         </w:rPr>
-        <w:t xml:space="preserve">Two notes on these numbers. The realistic case is sized to fit within your existing team; the expert witness opportunity in particular is one individual's caseload. Work the team absorbs without hiring only costs the time spent delivering it, so each additional instruction keeps considerably more than the firm's overall 20%, because the rent and the salaries are already covered. The stretch case is the point where a hire would enter the picture, and the day-90 evidence is the right basis for that decision. Finally, these are year-one figures while the pages climb; the same pages continue to produce in year two without further build cost.</w:t>
+        <w:t xml:space="preserve">Two notes on these numbers. The realistic case is sized to fit within your existing team; the expert witness opportunity in particular is one individual's caseload. Work the team absorbs without hiring only costs the time spent delivering it, so each additional instruction keeps considerably more than the firm's overall 20%, because the rent and the salaries are already covered. The stretch case is the point where a hire would enter the picture, and the day-90 evidence is the right basis for that decision. Finally, the pages built in this project continue to produce in year two without further build cost.</w:t>
       </w:r>
     </w:p>
     <w:sectPr>

</xml_diff>

<commit_message>
Reformat scenario table to house layout; expert witness full gap in stretch
Co-Authored-By: Claude Fable 5 <noreply@anthropic.com>
Claude-Session: https://claude.ai/code/session_015m2wC9de21Ykdh6niNZrqh
</commit_message>
<xml_diff>
--- a/HarrisonClarke-First-90-Days.docx
+++ b/HarrisonClarke-First-90-Days.docx
@@ -763,15 +763,15 @@
         </w:tblBorders>
       </w:tblPr>
       <w:tblGrid>
-        <w:gridCol w:w="1500"/>
-        <w:gridCol w:w="5600"/>
+        <w:gridCol w:w="1700"/>
+        <w:gridCol w:w="5400"/>
         <w:gridCol w:w="1900"/>
       </w:tblGrid>
       <w:tr>
         <w:tc>
           <w:tcPr>
-            <w:tcW w:type="dxa" w:w="1500"/>
-            <w:shd w:fill="1F3864" w:val="clear"/>
+            <w:tcW w:type="dxa" w:w="1700"/>
+            <w:shd w:fill="ED7D31" w:val="clear"/>
             <w:tcMar>
               <w:top w:type="dxa" w:w="40"/>
               <w:left w:type="dxa" w:w="80"/>
@@ -794,8 +794,8 @@
         </w:tc>
         <w:tc>
           <w:tcPr>
-            <w:tcW w:type="dxa" w:w="5600"/>
-            <w:shd w:fill="1F3864" w:val="clear"/>
+            <w:tcW w:type="dxa" w:w="5400"/>
+            <w:shd w:fill="ED7D31" w:val="clear"/>
             <w:tcMar>
               <w:top w:type="dxa" w:w="40"/>
               <w:left w:type="dxa" w:w="80"/>
@@ -812,14 +812,14 @@
                 <w:sz w:val="18"/>
                 <w:szCs w:val="18"/>
               </w:rPr>
-              <w:t xml:space="preserve">What changes</w:t>
+              <w:t xml:space="preserve">Additional work</w:t>
             </w:r>
           </w:p>
         </w:tc>
         <w:tc>
           <w:tcPr>
             <w:tcW w:type="dxa" w:w="1900"/>
-            <w:shd w:fill="1F3864" w:val="clear"/>
+            <w:shd w:fill="ED7D31" w:val="clear"/>
             <w:tcMar>
               <w:top w:type="dxa" w:w="40"/>
               <w:left w:type="dxa" w:w="80"/>
@@ -847,7 +847,7 @@
       <w:tr>
         <w:tc>
           <w:tcPr>
-            <w:tcW w:type="dxa" w:w="1500"/>
+            <w:tcW w:type="dxa" w:w="1700"/>
             <w:tcMar>
               <w:top w:type="dxa" w:w="40"/>
               <w:left w:type="dxa" w:w="80"/>
@@ -869,23 +869,48 @@
         </w:tc>
         <w:tc>
           <w:tcPr>
-            <w:tcW w:type="dxa" w:w="5600"/>
-            <w:tcMar>
-              <w:top w:type="dxa" w:w="40"/>
-              <w:left w:type="dxa" w:w="80"/>
-              <w:bottom w:type="dxa" w:w="40"/>
-              <w:right w:type="dxa" w:w="80"/>
-            </w:tcMar>
-          </w:tcPr>
-          <w:p>
-            <w:r>
-              <w:rPr>
-                <w:b w:val="false"/>
-                <w:bCs w:val="false"/>
-                <w:sz w:val="18"/>
-                <w:szCs w:val="18"/>
-              </w:rPr>
-              <w:t xml:space="preserve">1 dilapidations instruction a month from month 6; 6 commercial surveys; 15% of the expert witness gap; 2 extra party wall enquiries a month</w:t>
+            <w:tcW w:type="dxa" w:w="5400"/>
+            <w:tcMar>
+              <w:top w:type="dxa" w:w="40"/>
+              <w:left w:type="dxa" w:w="80"/>
+              <w:bottom w:type="dxa" w:w="40"/>
+              <w:right w:type="dxa" w:w="80"/>
+            </w:tcMar>
+          </w:tcPr>
+          <w:p>
+            <w:r>
+              <w:rPr>
+                <w:sz w:val="18"/>
+                <w:szCs w:val="18"/>
+              </w:rPr>
+              <w:t xml:space="preserve">+ 1 dilapidations instruction a month from month 6</w:t>
+            </w:r>
+          </w:p>
+          <w:p>
+            <w:r>
+              <w:rPr>
+                <w:sz w:val="18"/>
+                <w:szCs w:val="18"/>
+              </w:rPr>
+              <w:t xml:space="preserve">+ 6 commercial surveys</w:t>
+            </w:r>
+          </w:p>
+          <w:p>
+            <w:r>
+              <w:rPr>
+                <w:sz w:val="18"/>
+                <w:szCs w:val="18"/>
+              </w:rPr>
+              <w:t xml:space="preserve">+ 15% of the expert witness gap</w:t>
+            </w:r>
+          </w:p>
+          <w:p>
+            <w:r>
+              <w:rPr>
+                <w:sz w:val="18"/>
+                <w:szCs w:val="18"/>
+              </w:rPr>
+              <w:t xml:space="preserve">+ 2 extra party wall enquiries a month</w:t>
             </w:r>
           </w:p>
         </w:tc>
@@ -918,7 +943,7 @@
       <w:tr>
         <w:tc>
           <w:tcPr>
-            <w:tcW w:type="dxa" w:w="1500"/>
+            <w:tcW w:type="dxa" w:w="1700"/>
             <w:tcMar>
               <w:top w:type="dxa" w:w="40"/>
               <w:left w:type="dxa" w:w="80"/>
@@ -940,23 +965,48 @@
         </w:tc>
         <w:tc>
           <w:tcPr>
-            <w:tcW w:type="dxa" w:w="5600"/>
-            <w:tcMar>
-              <w:top w:type="dxa" w:w="40"/>
-              <w:left w:type="dxa" w:w="80"/>
-              <w:bottom w:type="dxa" w:w="40"/>
-              <w:right w:type="dxa" w:w="80"/>
-            </w:tcMar>
-          </w:tcPr>
-          <w:p>
-            <w:r>
-              <w:rPr>
-                <w:b w:val="false"/>
-                <w:bCs w:val="false"/>
-                <w:sz w:val="18"/>
-                <w:szCs w:val="18"/>
-              </w:rPr>
-              <w:t xml:space="preserve">1 to 1.5 London dilapidations instructions a month; 1 commercial survey a month; a third of the expert witness gap; 4 extra party wall enquiries a month</w:t>
+            <w:tcW w:type="dxa" w:w="5400"/>
+            <w:tcMar>
+              <w:top w:type="dxa" w:w="40"/>
+              <w:left w:type="dxa" w:w="80"/>
+              <w:bottom w:type="dxa" w:w="40"/>
+              <w:right w:type="dxa" w:w="80"/>
+            </w:tcMar>
+          </w:tcPr>
+          <w:p>
+            <w:r>
+              <w:rPr>
+                <w:sz w:val="18"/>
+                <w:szCs w:val="18"/>
+              </w:rPr>
+              <w:t xml:space="preserve">+ 1 to 1.5 London dilapidations instructions a month</w:t>
+            </w:r>
+          </w:p>
+          <w:p>
+            <w:r>
+              <w:rPr>
+                <w:sz w:val="18"/>
+                <w:szCs w:val="18"/>
+              </w:rPr>
+              <w:t xml:space="preserve">+ 1 commercial survey a month</w:t>
+            </w:r>
+          </w:p>
+          <w:p>
+            <w:r>
+              <w:rPr>
+                <w:sz w:val="18"/>
+                <w:szCs w:val="18"/>
+              </w:rPr>
+              <w:t xml:space="preserve">+ 33% of the expert witness gap</w:t>
+            </w:r>
+          </w:p>
+          <w:p>
+            <w:r>
+              <w:rPr>
+                <w:sz w:val="18"/>
+                <w:szCs w:val="18"/>
+              </w:rPr>
+              <w:t xml:space="preserve">+ 4 extra party wall enquiries a month</w:t>
             </w:r>
           </w:p>
         </w:tc>
@@ -989,7 +1039,7 @@
       <w:tr>
         <w:tc>
           <w:tcPr>
-            <w:tcW w:type="dxa" w:w="1500"/>
+            <w:tcW w:type="dxa" w:w="1700"/>
             <w:tcMar>
               <w:top w:type="dxa" w:w="40"/>
               <w:left w:type="dxa" w:w="80"/>
@@ -1011,23 +1061,48 @@
         </w:tc>
         <w:tc>
           <w:tcPr>
-            <w:tcW w:type="dxa" w:w="5600"/>
-            <w:tcMar>
-              <w:top w:type="dxa" w:w="40"/>
-              <w:left w:type="dxa" w:w="80"/>
-              <w:bottom w:type="dxa" w:w="40"/>
-              <w:right w:type="dxa" w:w="80"/>
-            </w:tcMar>
-          </w:tcPr>
-          <w:p>
-            <w:r>
-              <w:rPr>
-                <w:b w:val="false"/>
-                <w:bCs w:val="false"/>
-                <w:sz w:val="18"/>
-                <w:szCs w:val="18"/>
-              </w:rPr>
-              <w:t xml:space="preserve">2 dilapidations instructions a month; two-thirds of the expert witness gap, or half plus one complex case; 18 commercial surveys; 8 extra party wall enquiries a month with London contributing</w:t>
+            <w:tcW w:type="dxa" w:w="5400"/>
+            <w:tcMar>
+              <w:top w:type="dxa" w:w="40"/>
+              <w:left w:type="dxa" w:w="80"/>
+              <w:bottom w:type="dxa" w:w="40"/>
+              <w:right w:type="dxa" w:w="80"/>
+            </w:tcMar>
+          </w:tcPr>
+          <w:p>
+            <w:r>
+              <w:rPr>
+                <w:sz w:val="18"/>
+                <w:szCs w:val="18"/>
+              </w:rPr>
+              <w:t xml:space="preserve">+ 2 dilapidations instructions a month</w:t>
+            </w:r>
+          </w:p>
+          <w:p>
+            <w:r>
+              <w:rPr>
+                <w:sz w:val="18"/>
+                <w:szCs w:val="18"/>
+              </w:rPr>
+              <w:t xml:space="preserve">+ 18 commercial surveys</w:t>
+            </w:r>
+          </w:p>
+          <w:p>
+            <w:r>
+              <w:rPr>
+                <w:sz w:val="18"/>
+                <w:szCs w:val="18"/>
+              </w:rPr>
+              <w:t xml:space="preserve">+ 100% of the expert witness gap</w:t>
+            </w:r>
+          </w:p>
+          <w:p>
+            <w:r>
+              <w:rPr>
+                <w:sz w:val="18"/>
+                <w:szCs w:val="18"/>
+              </w:rPr>
+              <w:t xml:space="preserve">+ 8 extra party wall enquiries a month (London contributing)</w:t>
             </w:r>
           </w:p>
         </w:tc>
@@ -1052,7 +1127,7 @@
                 <w:sz w:val="18"/>
                 <w:szCs w:val="18"/>
               </w:rPr>
-              <w:t xml:space="preserve">~£300k</w:t>
+              <w:t xml:space="preserve">~£350k</w:t>
             </w:r>
           </w:p>
         </w:tc>

</xml_diff>

<commit_message>
Restate scenarios as plain job counts at average fees
Co-Authored-By: Claude Fable 5 <noreply@anthropic.com>
Claude-Session: https://claude.ai/code/session_015m2wC9de21Ykdh6niNZrqh
</commit_message>
<xml_diff>
--- a/HarrisonClarke-First-90-Days.docx
+++ b/HarrisonClarke-First-90-Days.docx
@@ -747,7 +747,7 @@
           <w:sz w:val="19"/>
           <w:szCs w:val="19"/>
         </w:rPr>
-        <w:t xml:space="preserve">Every number below uses the fees and close rates Tim gave us: dilapidations instructions at £2,500 to £8,000, expert witness measured against the £150k Southampton gap Tim has already quantified, commercial surveys at £2,500 on average, and party wall converting one enquiry in two at around £1,350 per award. Residential work is excluded from the targets, so anything it adds is on top.</w:t>
+        <w:t xml:space="preserve">Every line below is extra jobs won over the first year, priced at the average fees Tim gave us. The party wall counts already apply his one-in-two close rate on enquiries, and the expert witness counts sit inside the £300k of capacity Tim has identified for one individual. Multiply any line out and you get the total. Residential work is excluded from the targets, so anything it adds is on top.</w:t>
       </w:r>
     </w:p>
     <w:tbl>
@@ -883,34 +883,34 @@
                 <w:sz w:val="18"/>
                 <w:szCs w:val="18"/>
               </w:rPr>
-              <w:t xml:space="preserve">+ 1 dilapidations instruction a month from month 6</w:t>
-            </w:r>
-          </w:p>
-          <w:p>
-            <w:r>
-              <w:rPr>
-                <w:sz w:val="18"/>
-                <w:szCs w:val="18"/>
-              </w:rPr>
-              <w:t xml:space="preserve">+ 6 commercial surveys</w:t>
-            </w:r>
-          </w:p>
-          <w:p>
-            <w:r>
-              <w:rPr>
-                <w:sz w:val="18"/>
-                <w:szCs w:val="18"/>
-              </w:rPr>
-              <w:t xml:space="preserve">+ 15% of the expert witness gap</w:t>
-            </w:r>
-          </w:p>
-          <w:p>
-            <w:r>
-              <w:rPr>
-                <w:sz w:val="18"/>
-                <w:szCs w:val="18"/>
-              </w:rPr>
-              <w:t xml:space="preserve">+ 2 extra party wall enquiries a month</w:t>
+              <w:t xml:space="preserve">+ 7 dilapidations instructions (avg £3,500)</w:t>
+            </w:r>
+          </w:p>
+          <w:p>
+            <w:r>
+              <w:rPr>
+                <w:sz w:val="18"/>
+                <w:szCs w:val="18"/>
+              </w:rPr>
+              <w:t xml:space="preserve">+ 6 commercial surveys (avg £2,500)</w:t>
+            </w:r>
+          </w:p>
+          <w:p>
+            <w:r>
+              <w:rPr>
+                <w:sz w:val="18"/>
+                <w:szCs w:val="18"/>
+              </w:rPr>
+              <w:t xml:space="preserve">+ 5 expert witness instructions (avg £4,000)</w:t>
+            </w:r>
+          </w:p>
+          <w:p>
+            <w:r>
+              <w:rPr>
+                <w:sz w:val="18"/>
+                <w:szCs w:val="18"/>
+              </w:rPr>
+              <w:t xml:space="preserve">+ 12 party wall jobs (avg £1,350)</w:t>
             </w:r>
           </w:p>
         </w:tc>
@@ -979,34 +979,34 @@
                 <w:sz w:val="18"/>
                 <w:szCs w:val="18"/>
               </w:rPr>
-              <w:t xml:space="preserve">+ 1 London dilapidations instruction a month (14 over the year)</w:t>
-            </w:r>
-          </w:p>
-          <w:p>
-            <w:r>
-              <w:rPr>
-                <w:sz w:val="18"/>
-                <w:szCs w:val="18"/>
-              </w:rPr>
-              <w:t xml:space="preserve">+ 1 commercial survey a month</w:t>
-            </w:r>
-          </w:p>
-          <w:p>
-            <w:r>
-              <w:rPr>
-                <w:sz w:val="18"/>
-                <w:szCs w:val="18"/>
-              </w:rPr>
-              <w:t xml:space="preserve">+ 33% of the expert witness gap</w:t>
-            </w:r>
-          </w:p>
-          <w:p>
-            <w:r>
-              <w:rPr>
-                <w:sz w:val="18"/>
-                <w:szCs w:val="18"/>
-              </w:rPr>
-              <w:t xml:space="preserve">+ 4 extra party wall enquiries a month</w:t>
+              <w:t xml:space="preserve">+ 14 dilapidations instructions (avg £4,000)</w:t>
+            </w:r>
+          </w:p>
+          <w:p>
+            <w:r>
+              <w:rPr>
+                <w:sz w:val="18"/>
+                <w:szCs w:val="18"/>
+              </w:rPr>
+              <w:t xml:space="preserve">+ 12 commercial surveys (avg £2,500)</w:t>
+            </w:r>
+          </w:p>
+          <w:p>
+            <w:r>
+              <w:rPr>
+                <w:sz w:val="18"/>
+                <w:szCs w:val="18"/>
+              </w:rPr>
+              <w:t xml:space="preserve">+ 12 expert witness instructions (avg £4,000)</w:t>
+            </w:r>
+          </w:p>
+          <w:p>
+            <w:r>
+              <w:rPr>
+                <w:sz w:val="18"/>
+                <w:szCs w:val="18"/>
+              </w:rPr>
+              <w:t xml:space="preserve">+ 24 party wall jobs (avg £1,350)</w:t>
             </w:r>
           </w:p>
         </w:tc>
@@ -1031,7 +1031,7 @@
                 <w:sz w:val="18"/>
                 <w:szCs w:val="18"/>
               </w:rPr>
-              <w:t xml:space="preserve">~£170k</w:t>
+              <w:t xml:space="preserve">~£165k</w:t>
             </w:r>
           </w:p>
         </w:tc>
@@ -1075,34 +1075,34 @@
                 <w:sz w:val="18"/>
                 <w:szCs w:val="18"/>
               </w:rPr>
-              <w:t xml:space="preserve">+ 2 dilapidations instructions a month</w:t>
-            </w:r>
-          </w:p>
-          <w:p>
-            <w:r>
-              <w:rPr>
-                <w:sz w:val="18"/>
-                <w:szCs w:val="18"/>
-              </w:rPr>
-              <w:t xml:space="preserve">+ 18 commercial surveys</w:t>
-            </w:r>
-          </w:p>
-          <w:p>
-            <w:r>
-              <w:rPr>
-                <w:sz w:val="18"/>
-                <w:szCs w:val="18"/>
-              </w:rPr>
-              <w:t xml:space="preserve">+ 100% of the expert witness gap</w:t>
-            </w:r>
-          </w:p>
-          <w:p>
-            <w:r>
-              <w:rPr>
-                <w:sz w:val="18"/>
-                <w:szCs w:val="18"/>
-              </w:rPr>
-              <w:t xml:space="preserve">+ 8 extra party wall enquiries a month (London contributing)</w:t>
+              <w:t xml:space="preserve">+ 20 dilapidations instructions (avg £4,500)</w:t>
+            </w:r>
+          </w:p>
+          <w:p>
+            <w:r>
+              <w:rPr>
+                <w:sz w:val="18"/>
+                <w:szCs w:val="18"/>
+              </w:rPr>
+              <w:t xml:space="preserve">+ 18 commercial surveys (avg £2,500)</w:t>
+            </w:r>
+          </w:p>
+          <w:p>
+            <w:r>
+              <w:rPr>
+                <w:sz w:val="18"/>
+                <w:szCs w:val="18"/>
+              </w:rPr>
+              <w:t xml:space="preserve">+ 36 expert witness instructions (avg £4,000)</w:t>
+            </w:r>
+          </w:p>
+          <w:p>
+            <w:r>
+              <w:rPr>
+                <w:sz w:val="18"/>
+                <w:szCs w:val="18"/>
+              </w:rPr>
+              <w:t xml:space="preserve">+ 48 party wall jobs (avg £1,350)</w:t>
             </w:r>
           </w:p>
         </w:tc>
@@ -1127,7 +1127,7 @@
                 <w:sz w:val="18"/>
                 <w:szCs w:val="18"/>
               </w:rPr>
-              <w:t xml:space="preserve">~£350k</w:t>
+              <w:t xml:space="preserve">~£345k</w:t>
             </w:r>
           </w:p>
         </w:tc>
@@ -1154,7 +1154,7 @@
           <w:sz w:val="19"/>
           <w:szCs w:val="19"/>
         </w:rPr>
-        <w:t xml:space="preserve">These are first-year totals, and the early months are build time. By month 12 the realistic case is running at roughly £185k a year.</w:t>
+        <w:t xml:space="preserve">These are first-year totals and the early months are build time, so the run rate by month 12 is higher than the averages above suggest.</w:t>
       </w:r>
     </w:p>
     <w:p>

</xml_diff>